<commit_message>
Align nine migration packs with scoped children and native addresses
</commit_message>
<xml_diff>
--- a/docs/customer/commercial/ModuPorter-Domains-Manual-DE-1.0.0.docx
+++ b/docs/customer/commercial/ModuPorter-Domains-Manual-DE-1.0.0.docx
@@ -314,7 +314,7 @@
                 <w:color w:val="000000"/>
                 <w:sz w:val="20"/>
               </w:rPr>
-              <w:t>18</w:t>
+              <w:t>20</w:t>
             </w:r>
           </w:p>
         </w:tc>
@@ -333,7 +333,7 @@
                 <w:color w:val="000000"/>
                 <w:sz w:val="20"/>
               </w:rPr>
-              <w:t>60</w:t>
+              <w:t>66</w:t>
             </w:r>
           </w:p>
         </w:tc>
@@ -395,7 +395,7 @@
                 <w:color w:val="000000"/>
                 <w:sz w:val="20"/>
               </w:rPr>
-              <w:t>14</w:t>
+              <w:t>17</w:t>
             </w:r>
           </w:p>
         </w:tc>
@@ -414,7 +414,7 @@
                 <w:color w:val="000000"/>
                 <w:sz w:val="20"/>
               </w:rPr>
-              <w:t>49</w:t>
+              <w:t>58</w:t>
             </w:r>
           </w:p>
         </w:tc>
@@ -476,7 +476,7 @@
                 <w:color w:val="000000"/>
                 <w:sz w:val="20"/>
               </w:rPr>
-              <w:t>17</w:t>
+              <w:t>18</w:t>
             </w:r>
           </w:p>
         </w:tc>
@@ -495,7 +495,7 @@
                 <w:color w:val="000000"/>
                 <w:sz w:val="20"/>
               </w:rPr>
-              <w:t>57</w:t>
+              <w:t>60</w:t>
             </w:r>
           </w:p>
         </w:tc>
@@ -557,7 +557,7 @@
                 <w:color w:val="000000"/>
                 <w:sz w:val="20"/>
               </w:rPr>
-              <w:t>13</w:t>
+              <w:t>14</w:t>
             </w:r>
           </w:p>
         </w:tc>
@@ -576,7 +576,7 @@
                 <w:color w:val="000000"/>
                 <w:sz w:val="20"/>
               </w:rPr>
-              <w:t>46</w:t>
+              <w:t>49</w:t>
             </w:r>
           </w:p>
         </w:tc>
@@ -638,7 +638,7 @@
                 <w:color w:val="000000"/>
                 <w:sz w:val="20"/>
               </w:rPr>
-              <w:t>20</w:t>
+              <w:t>23</w:t>
             </w:r>
           </w:p>
         </w:tc>
@@ -657,7 +657,7 @@
                 <w:color w:val="000000"/>
                 <w:sz w:val="20"/>
               </w:rPr>
-              <w:t>67</w:t>
+              <w:t>74</w:t>
             </w:r>
           </w:p>
         </w:tc>
@@ -719,7 +719,7 @@
                 <w:color w:val="000000"/>
                 <w:sz w:val="20"/>
               </w:rPr>
-              <w:t>16</w:t>
+              <w:t>21</w:t>
             </w:r>
           </w:p>
         </w:tc>
@@ -738,7 +738,7 @@
                 <w:color w:val="000000"/>
                 <w:sz w:val="20"/>
               </w:rPr>
-              <w:t>52</w:t>
+              <w:t>63</w:t>
             </w:r>
           </w:p>
         </w:tc>
@@ -988,6 +988,19 @@
         <w:t>Vollständige Modul- und Feldlisten stehen in docs/SUPPORTED_SCOPE.md, mapping und FIELD_CATALOG.csv. VDM.html zeigt die Objektabhängigkeiten. Die Templates enthalten keine automatische Buchungsimplementierung und keine Zusage zur Abdeckung jeder SAP-Funktion.</w:t>
       </w:r>
     </w:p>
+    <w:p>
+      <w:pPr>
+        <w:pStyle w:val="Heading1"/>
+      </w:pPr>
+      <w:r>
+        <w:t>Stammsätze und Kindstrukturen</w:t>
+      </w:r>
+    </w:p>
+    <w:p>
+      <w:r>
+        <w:t>Stammsätze bleiben eindeutig; wiederholbare Texte, Partner, Status, Organisationsebenen und Gültigkeitsintervalle behalten getrennte Strukturen und vollständige Schlüssel. Die Vorbereitung begrenzt Kinddaten auf ausgewählte Eltern und lehnt doppelte Elternschlüssel ab. Native Adressen ergänzen technische Objekte, FI-Geschäftspartner und Banken, SD-Belegpartner und CO-Stammsätze. Fehlende Standardadressen erhalten den Stammsatz; Varianten bleiben Referenzdaten. SAP erzeugt Systemstatus und technische Zielnummern. SD-Kopfdaten behalten Position 000000; Positionsdaten folgen ausgewählten Positionen. Maßgeblich sind customer/parent-relationships.json, docs/MASTER_CHILD_ARCHITECTURE.md und die gewählte Zielschnittstelle.</w:t>
+      </w:r>
+    </w:p>
     <w:sectPr>
       <w:pgSz w:w="11906" w:h="16838"/>
       <w:pgMar w:top="1020" w:right="1020" w:bottom="1020" w:left="1020" w:header="720" w:footer="720" w:gutter="0"/>
@@ -1480,7 +1493,7 @@
       <w:rFonts w:asciiTheme="majorHAnsi" w:eastAsiaTheme="majorEastAsia" w:hAnsiTheme="majorHAnsi" w:cstheme="majorBidi"/>
       <w:b/>
       <w:bCs/>
-      <w:color w:val="4F81BD" w:themeColor="accent1"/>
+      <w:color w:val="000000"/>
     </w:rPr>
   </w:style>
   <w:style w:type="paragraph" w:styleId="Heading4">
@@ -1505,7 +1518,7 @@
       <w:bCs/>
       <w:i/>
       <w:iCs/>
-      <w:color w:val="4F81BD" w:themeColor="accent1"/>
+      <w:color w:val="000000"/>
     </w:rPr>
   </w:style>
   <w:style w:type="paragraph" w:styleId="Heading5">
@@ -1526,7 +1539,7 @@
     </w:pPr>
     <w:rPr>
       <w:rFonts w:asciiTheme="majorHAnsi" w:eastAsiaTheme="majorEastAsia" w:hAnsiTheme="majorHAnsi" w:cstheme="majorBidi"/>
-      <w:color w:val="243F60" w:themeColor="accent1" w:themeShade="7F"/>
+      <w:color w:val="000000"/>
     </w:rPr>
   </w:style>
   <w:style w:type="paragraph" w:styleId="Heading6">
@@ -1549,7 +1562,7 @@
       <w:rFonts w:asciiTheme="majorHAnsi" w:eastAsiaTheme="majorEastAsia" w:hAnsiTheme="majorHAnsi" w:cstheme="majorBidi"/>
       <w:i/>
       <w:iCs/>
-      <w:color w:val="243F60" w:themeColor="accent1" w:themeShade="7F"/>
+      <w:color w:val="000000"/>
     </w:rPr>
   </w:style>
   <w:style w:type="paragraph" w:styleId="Heading7">
@@ -1572,7 +1585,7 @@
       <w:rFonts w:asciiTheme="majorHAnsi" w:eastAsiaTheme="majorEastAsia" w:hAnsiTheme="majorHAnsi" w:cstheme="majorBidi"/>
       <w:i/>
       <w:iCs/>
-      <w:color w:val="404040" w:themeColor="text1" w:themeTint="BF"/>
+      <w:color w:val="000000"/>
     </w:rPr>
   </w:style>
   <w:style w:type="paragraph" w:styleId="Heading8">
@@ -1593,7 +1606,7 @@
     </w:pPr>
     <w:rPr>
       <w:rFonts w:asciiTheme="majorHAnsi" w:eastAsiaTheme="majorEastAsia" w:hAnsiTheme="majorHAnsi" w:cstheme="majorBidi"/>
-      <w:color w:val="4F81BD" w:themeColor="accent1"/>
+      <w:color w:val="000000"/>
       <w:sz w:val="20"/>
       <w:szCs w:val="20"/>
     </w:rPr>
@@ -1618,7 +1631,7 @@
       <w:rFonts w:asciiTheme="majorHAnsi" w:eastAsiaTheme="majorEastAsia" w:hAnsiTheme="majorHAnsi" w:cstheme="majorBidi"/>
       <w:i/>
       <w:iCs/>
-      <w:color w:val="404040" w:themeColor="text1" w:themeTint="BF"/>
+      <w:color w:val="000000"/>
       <w:sz w:val="20"/>
       <w:szCs w:val="20"/>
     </w:rPr>
@@ -1669,7 +1682,7 @@
       <w:rFonts w:asciiTheme="majorHAnsi" w:eastAsiaTheme="majorEastAsia" w:hAnsiTheme="majorHAnsi" w:cstheme="majorBidi"/>
       <w:b/>
       <w:bCs/>
-      <w:color w:val="365F91" w:themeColor="accent1" w:themeShade="BF"/>
+      <w:color w:val="000000"/>
       <w:sz w:val="28"/>
       <w:szCs w:val="28"/>
     </w:rPr>
@@ -1684,7 +1697,7 @@
       <w:rFonts w:asciiTheme="majorHAnsi" w:eastAsiaTheme="majorEastAsia" w:hAnsiTheme="majorHAnsi" w:cstheme="majorBidi"/>
       <w:b/>
       <w:bCs/>
-      <w:color w:val="4F81BD" w:themeColor="accent1"/>
+      <w:color w:val="000000"/>
       <w:sz w:val="26"/>
       <w:szCs w:val="26"/>
     </w:rPr>
@@ -1699,7 +1712,7 @@
       <w:rFonts w:asciiTheme="majorHAnsi" w:eastAsiaTheme="majorEastAsia" w:hAnsiTheme="majorHAnsi" w:cstheme="majorBidi"/>
       <w:b/>
       <w:bCs/>
-      <w:color w:val="4F81BD" w:themeColor="accent1"/>
+      <w:color w:val="000000"/>
     </w:rPr>
   </w:style>
   <w:style w:type="paragraph" w:styleId="Title">
@@ -1755,7 +1768,7 @@
       <w:rFonts w:asciiTheme="majorHAnsi" w:eastAsiaTheme="majorEastAsia" w:hAnsiTheme="majorHAnsi" w:cstheme="majorBidi"/>
       <w:i/>
       <w:iCs/>
-      <w:color w:val="4F81BD" w:themeColor="accent1"/>
+      <w:color w:val="000000"/>
       <w:spacing w:val="15"/>
       <w:sz w:val="24"/>
       <w:szCs w:val="24"/>
@@ -2071,7 +2084,7 @@
       <w:bCs/>
       <w:i/>
       <w:iCs/>
-      <w:color w:val="4F81BD" w:themeColor="accent1"/>
+      <w:color w:val="000000"/>
     </w:rPr>
   </w:style>
   <w:style w:type="character" w:customStyle="1" w:styleId="Heading5Char">
@@ -2083,7 +2096,7 @@
     <w:rsid w:val="00FC693F"/>
     <w:rPr>
       <w:rFonts w:asciiTheme="majorHAnsi" w:eastAsiaTheme="majorEastAsia" w:hAnsiTheme="majorHAnsi" w:cstheme="majorBidi"/>
-      <w:color w:val="243F60" w:themeColor="accent1" w:themeShade="7F"/>
+      <w:color w:val="000000"/>
     </w:rPr>
   </w:style>
   <w:style w:type="character" w:customStyle="1" w:styleId="Heading6Char">
@@ -2097,7 +2110,7 @@
       <w:rFonts w:asciiTheme="majorHAnsi" w:eastAsiaTheme="majorEastAsia" w:hAnsiTheme="majorHAnsi" w:cstheme="majorBidi"/>
       <w:i/>
       <w:iCs/>
-      <w:color w:val="243F60" w:themeColor="accent1" w:themeShade="7F"/>
+      <w:color w:val="000000"/>
     </w:rPr>
   </w:style>
   <w:style w:type="character" w:customStyle="1" w:styleId="Heading7Char">
@@ -2111,7 +2124,7 @@
       <w:rFonts w:asciiTheme="majorHAnsi" w:eastAsiaTheme="majorEastAsia" w:hAnsiTheme="majorHAnsi" w:cstheme="majorBidi"/>
       <w:i/>
       <w:iCs/>
-      <w:color w:val="404040" w:themeColor="text1" w:themeTint="BF"/>
+      <w:color w:val="000000"/>
     </w:rPr>
   </w:style>
   <w:style w:type="character" w:customStyle="1" w:styleId="Heading8Char">
@@ -2123,7 +2136,7 @@
     <w:rsid w:val="00FC693F"/>
     <w:rPr>
       <w:rFonts w:asciiTheme="majorHAnsi" w:eastAsiaTheme="majorEastAsia" w:hAnsiTheme="majorHAnsi" w:cstheme="majorBidi"/>
-      <w:color w:val="4F81BD" w:themeColor="accent1"/>
+      <w:color w:val="000000"/>
       <w:sz w:val="20"/>
       <w:szCs w:val="20"/>
     </w:rPr>
@@ -2139,7 +2152,7 @@
       <w:rFonts w:asciiTheme="majorHAnsi" w:eastAsiaTheme="majorEastAsia" w:hAnsiTheme="majorHAnsi" w:cstheme="majorBidi"/>
       <w:i/>
       <w:iCs/>
-      <w:color w:val="404040" w:themeColor="text1" w:themeTint="BF"/>
+      <w:color w:val="000000"/>
       <w:sz w:val="20"/>
       <w:szCs w:val="20"/>
     </w:rPr>

</xml_diff>

<commit_message>
Complete native child coverage across nine migration packs
</commit_message>
<xml_diff>
--- a/docs/customer/commercial/ModuPorter-Domains-Manual-DE-1.0.0.docx
+++ b/docs/customer/commercial/ModuPorter-Domains-Manual-DE-1.0.0.docx
@@ -152,7 +152,7 @@
                 <w:color w:val="000000"/>
                 <w:sz w:val="20"/>
               </w:rPr>
-              <w:t>5</w:t>
+              <w:t>6</w:t>
             </w:r>
           </w:p>
         </w:tc>
@@ -171,7 +171,7 @@
                 <w:color w:val="000000"/>
                 <w:sz w:val="20"/>
               </w:rPr>
-              <w:t>18</w:t>
+              <w:t>21</w:t>
             </w:r>
           </w:p>
         </w:tc>
@@ -233,7 +233,7 @@
                 <w:color w:val="000000"/>
                 <w:sz w:val="20"/>
               </w:rPr>
-              <w:t>26</w:t>
+              <w:t>42</w:t>
             </w:r>
           </w:p>
         </w:tc>
@@ -252,7 +252,7 @@
                 <w:color w:val="000000"/>
                 <w:sz w:val="20"/>
               </w:rPr>
-              <w:t>85</w:t>
+              <w:t>135</w:t>
             </w:r>
           </w:p>
         </w:tc>
@@ -314,7 +314,7 @@
                 <w:color w:val="000000"/>
                 <w:sz w:val="20"/>
               </w:rPr>
-              <w:t>20</w:t>
+              <w:t>26</w:t>
             </w:r>
           </w:p>
         </w:tc>
@@ -333,7 +333,7 @@
                 <w:color w:val="000000"/>
                 <w:sz w:val="20"/>
               </w:rPr>
-              <w:t>66</w:t>
+              <w:t>83</w:t>
             </w:r>
           </w:p>
         </w:tc>
@@ -395,7 +395,7 @@
                 <w:color w:val="000000"/>
                 <w:sz w:val="20"/>
               </w:rPr>
-              <w:t>17</w:t>
+              <w:t>30</w:t>
             </w:r>
           </w:p>
         </w:tc>
@@ -414,7 +414,7 @@
                 <w:color w:val="000000"/>
                 <w:sz w:val="20"/>
               </w:rPr>
-              <w:t>58</w:t>
+              <w:t>93</w:t>
             </w:r>
           </w:p>
         </w:tc>
@@ -476,7 +476,7 @@
                 <w:color w:val="000000"/>
                 <w:sz w:val="20"/>
               </w:rPr>
-              <w:t>18</w:t>
+              <w:t>22</w:t>
             </w:r>
           </w:p>
         </w:tc>
@@ -495,7 +495,7 @@
                 <w:color w:val="000000"/>
                 <w:sz w:val="20"/>
               </w:rPr>
-              <w:t>60</w:t>
+              <w:t>72</w:t>
             </w:r>
           </w:p>
         </w:tc>
@@ -557,7 +557,7 @@
                 <w:color w:val="000000"/>
                 <w:sz w:val="20"/>
               </w:rPr>
-              <w:t>14</w:t>
+              <w:t>21</w:t>
             </w:r>
           </w:p>
         </w:tc>
@@ -576,7 +576,7 @@
                 <w:color w:val="000000"/>
                 <w:sz w:val="20"/>
               </w:rPr>
-              <w:t>49</w:t>
+              <w:t>70</w:t>
             </w:r>
           </w:p>
         </w:tc>
@@ -638,7 +638,7 @@
                 <w:color w:val="000000"/>
                 <w:sz w:val="20"/>
               </w:rPr>
-              <w:t>23</w:t>
+              <w:t>50</w:t>
             </w:r>
           </w:p>
         </w:tc>
@@ -657,7 +657,7 @@
                 <w:color w:val="000000"/>
                 <w:sz w:val="20"/>
               </w:rPr>
-              <w:t>74</w:t>
+              <w:t>152</w:t>
             </w:r>
           </w:p>
         </w:tc>
@@ -719,7 +719,7 @@
                 <w:color w:val="000000"/>
                 <w:sz w:val="20"/>
               </w:rPr>
-              <w:t>21</w:t>
+              <w:t>26</w:t>
             </w:r>
           </w:p>
         </w:tc>
@@ -738,7 +738,7 @@
                 <w:color w:val="000000"/>
                 <w:sz w:val="20"/>
               </w:rPr>
-              <w:t>63</w:t>
+              <w:t>78</w:t>
             </w:r>
           </w:p>
         </w:tc>
@@ -998,7 +998,7 @@
     </w:p>
     <w:p>
       <w:r>
-        <w:t>Stammsätze bleiben eindeutig; wiederholbare Texte, Partner, Status, Organisationsebenen und Gültigkeitsintervalle behalten getrennte Strukturen und vollständige Schlüssel. Die Vorbereitung begrenzt Kinddaten auf ausgewählte Eltern und lehnt doppelte Elternschlüssel ab. Native Adressen ergänzen technische Objekte, FI-Geschäftspartner und Banken, SD-Belegpartner und CO-Stammsätze. Fehlende Standardadressen erhalten den Stammsatz; Varianten bleiben Referenzdaten. SAP erzeugt Systemstatus und technische Zielnummern. SD-Kopfdaten behalten Position 000000; Positionsdaten folgen ausgewählten Positionen. Maßgeblich sind customer/parent-relationships.json, docs/MASTER_CHILD_ARCHITECTURE.md und die gewählte Zielschnittstelle.</w:t>
+        <w:t>Stammsätze bleiben eindeutig; wiederholbare Texte, Partner, Status und Organisationsebenen behalten getrennte Strukturen und vollständige Schlüssel. customer/parent-relationships.json begrenzt Kinddaten auf ausgewählte Eltern. Fehlende Standardadressen erhalten den Stammsatz. SAP erzeugt Systemstatus und technische Zielnummern. docs/OBJECT_COVERAGE.md dokumentiert die konkreten Objekte und Felder. Langtextindizes benötigen vollständige SAPscript-Schlüssel und explizite Eigentümerdateien; READ_TEXT liefert Inhalt und Format. Siehe docs/LONG_TEXT_WORKFLOW.md. MM-Klassifikationen benötigen die Eigentümerzuordnung aus docs/CLASSIFICATION_WORKFLOW.md. Quellfelder gegen die gewählte unterstützte Zielschnittstelle mappen.</w:t>
       </w:r>
     </w:p>
     <w:sectPr>

</xml_diff>

<commit_message>
Remove all target comparison components and deliver source-only packs
</commit_message>
<xml_diff>
--- a/docs/customer/commercial/ModuPorter-Domains-Manual-DE-1.0.0.docx
+++ b/docs/customer/commercial/ModuPorter-Domains-Manual-DE-1.0.0.docx
@@ -17,7 +17,7 @@
     </w:p>
     <w:p>
       <w:r>
-        <w:t>Dieses Handbuch erklärt Installation, modulare Auswahl, Extraktion und Vergleich der gelieferten Migrationstemplates. Jedes Paket enthält separate SOURCE- und TARGET-Archive. Die Geschäftsobjekte werden über die kundenseitig gewählte SAP-Schnittstelle angelegt.</w:t>
+        <w:t>Dieses Handbuch erklärt die Installation, Modulauswahl und Quellextraktion der gelieferten Migrationstemplates. Jedes Paket enthält ein SOURCE-Importarchiv mit CDS-Views, Feldzuordnungen, Vorbereitungshilfen und einer VDM-Karte. Die Übernahme der extrahierten Daten erfolgt über die vom Kunden gewählte SAP-Schnittstelle.</w:t>
       </w:r>
     </w:p>
     <w:tbl>
@@ -28,7 +28,6 @@
       </w:tblPr>
       <w:tblGrid>
         <w:gridCol w:w="2891"/>
-        <w:gridCol w:w="2324"/>
         <w:gridCol w:w="2324"/>
         <w:gridCol w:w="2324"/>
       </w:tblGrid>
@@ -94,25 +93,6 @@
             </w:r>
           </w:p>
         </w:tc>
-        <w:tc>
-          <w:tcPr>
-            <w:tcW w:type="dxa" w:w="2324"/>
-            <w:shd w:fill="273D50"/>
-          </w:tcPr>
-          <w:p>
-            <w:pPr>
-              <w:spacing w:after="80" w:before="80"/>
-            </w:pPr>
-            <w:r>
-              <w:rPr>
-                <w:b/>
-                <w:color w:val="FFFFFF"/>
-                <w:sz w:val="20"/>
-              </w:rPr>
-              <w:t>Zielviews</w:t>
-            </w:r>
-          </w:p>
-        </w:tc>
       </w:tr>
       <w:tr>
         <w:trPr>
@@ -172,25 +152,6 @@
                 <w:sz w:val="20"/>
               </w:rPr>
               <w:t>21</w:t>
-            </w:r>
-          </w:p>
-        </w:tc>
-        <w:tc>
-          <w:tcPr>
-            <w:tcW w:type="dxa" w:w="2324"/>
-            <w:shd w:fill="F2F5F7"/>
-          </w:tcPr>
-          <w:p>
-            <w:pPr>
-              <w:spacing w:after="80" w:before="80"/>
-            </w:pPr>
-            <w:r>
-              <w:rPr>
-                <w:b w:val="0"/>
-                <w:color w:val="000000"/>
-                <w:sz w:val="20"/>
-              </w:rPr>
-              <w:t>2</w:t>
             </w:r>
           </w:p>
         </w:tc>
@@ -256,25 +217,6 @@
             </w:r>
           </w:p>
         </w:tc>
-        <w:tc>
-          <w:tcPr>
-            <w:tcW w:type="dxa" w:w="2324"/>
-            <w:shd w:fill="FFFFFF"/>
-          </w:tcPr>
-          <w:p>
-            <w:pPr>
-              <w:spacing w:after="80" w:before="80"/>
-            </w:pPr>
-            <w:r>
-              <w:rPr>
-                <w:b w:val="0"/>
-                <w:color w:val="000000"/>
-                <w:sz w:val="20"/>
-              </w:rPr>
-              <w:t>6</w:t>
-            </w:r>
-          </w:p>
-        </w:tc>
       </w:tr>
       <w:tr>
         <w:trPr>
@@ -334,25 +276,6 @@
                 <w:sz w:val="20"/>
               </w:rPr>
               <w:t>83</w:t>
-            </w:r>
-          </w:p>
-        </w:tc>
-        <w:tc>
-          <w:tcPr>
-            <w:tcW w:type="dxa" w:w="2324"/>
-            <w:shd w:fill="F2F5F7"/>
-          </w:tcPr>
-          <w:p>
-            <w:pPr>
-              <w:spacing w:after="80" w:before="80"/>
-            </w:pPr>
-            <w:r>
-              <w:rPr>
-                <w:b w:val="0"/>
-                <w:color w:val="000000"/>
-                <w:sz w:val="20"/>
-              </w:rPr>
-              <w:t>4</w:t>
             </w:r>
           </w:p>
         </w:tc>
@@ -418,25 +341,6 @@
             </w:r>
           </w:p>
         </w:tc>
-        <w:tc>
-          <w:tcPr>
-            <w:tcW w:type="dxa" w:w="2324"/>
-            <w:shd w:fill="FFFFFF"/>
-          </w:tcPr>
-          <w:p>
-            <w:pPr>
-              <w:spacing w:after="80" w:before="80"/>
-            </w:pPr>
-            <w:r>
-              <w:rPr>
-                <w:b w:val="0"/>
-                <w:color w:val="000000"/>
-                <w:sz w:val="20"/>
-              </w:rPr>
-              <w:t>4</w:t>
-            </w:r>
-          </w:p>
-        </w:tc>
       </w:tr>
       <w:tr>
         <w:trPr>
@@ -496,25 +400,6 @@
                 <w:sz w:val="20"/>
               </w:rPr>
               <w:t>72</w:t>
-            </w:r>
-          </w:p>
-        </w:tc>
-        <w:tc>
-          <w:tcPr>
-            <w:tcW w:type="dxa" w:w="2324"/>
-            <w:shd w:fill="F2F5F7"/>
-          </w:tcPr>
-          <w:p>
-            <w:pPr>
-              <w:spacing w:after="80" w:before="80"/>
-            </w:pPr>
-            <w:r>
-              <w:rPr>
-                <w:b w:val="0"/>
-                <w:color w:val="000000"/>
-                <w:sz w:val="20"/>
-              </w:rPr>
-              <w:t>2</w:t>
             </w:r>
           </w:p>
         </w:tc>
@@ -580,25 +465,6 @@
             </w:r>
           </w:p>
         </w:tc>
-        <w:tc>
-          <w:tcPr>
-            <w:tcW w:type="dxa" w:w="2324"/>
-            <w:shd w:fill="FFFFFF"/>
-          </w:tcPr>
-          <w:p>
-            <w:pPr>
-              <w:spacing w:after="80" w:before="80"/>
-            </w:pPr>
-            <w:r>
-              <w:rPr>
-                <w:b w:val="0"/>
-                <w:color w:val="000000"/>
-                <w:sz w:val="20"/>
-              </w:rPr>
-              <w:t>6</w:t>
-            </w:r>
-          </w:p>
-        </w:tc>
       </w:tr>
       <w:tr>
         <w:trPr>
@@ -658,25 +524,6 @@
                 <w:sz w:val="20"/>
               </w:rPr>
               <w:t>152</w:t>
-            </w:r>
-          </w:p>
-        </w:tc>
-        <w:tc>
-          <w:tcPr>
-            <w:tcW w:type="dxa" w:w="2324"/>
-            <w:shd w:fill="F2F5F7"/>
-          </w:tcPr>
-          <w:p>
-            <w:pPr>
-              <w:spacing w:after="80" w:before="80"/>
-            </w:pPr>
-            <w:r>
-              <w:rPr>
-                <w:b w:val="0"/>
-                <w:color w:val="000000"/>
-                <w:sz w:val="20"/>
-              </w:rPr>
-              <w:t>6</w:t>
             </w:r>
           </w:p>
         </w:tc>
@@ -742,28 +589,11 @@
             </w:r>
           </w:p>
         </w:tc>
-        <w:tc>
-          <w:tcPr>
-            <w:tcW w:type="dxa" w:w="2324"/>
-            <w:shd w:fill="FFFFFF"/>
-          </w:tcPr>
-          <w:p>
-            <w:pPr>
-              <w:spacing w:after="80" w:before="80"/>
-            </w:pPr>
-            <w:r>
-              <w:rPr>
-                <w:b w:val="0"/>
-                <w:color w:val="000000"/>
-                <w:sz w:val="20"/>
-              </w:rPr>
-              <w:t>6</w:t>
-            </w:r>
-          </w:p>
-        </w:tc>
       </w:tr>
     </w:tbl>
-    <w:p/>
+    <w:p>
+      <w:r/>
+    </w:p>
     <w:p>
       <w:pPr>
         <w:pStyle w:val="Heading2"/>
@@ -779,7 +609,7 @@
     </w:p>
     <w:p>
       <w:r>
-        <w:t>Basic liest native Tabellen und erhält deren Datengranularität. Composite bildet fachliche Spalten und Verknüpfungen. Consumption liefert die dokumentierten Exportstrukturen. Zielviews und CSV-Verträge dienen dem Vergleich derselben Population.</w:t>
+        <w:t>Basic liest native Tabellen und erhält deren Datengranularität. Composite stellt fachliche Spalten und Beziehungen bereit. Consumption liefert die dokumentierten Exportstrukturen. Wiederholbare Kinddaten bleiben getrennt und werden auf die ausgewählte Elternpopulation begrenzt.</w:t>
       </w:r>
     </w:p>
     <w:p>
@@ -792,7 +622,7 @@
     </w:p>
     <w:p>
       <w:r>
-        <w:t>Enthalten sind CDS-Quellen, abapGit-Metadaten, Feldzuordnungen, Aktivierungsreihenfolge, Umfangsbeschreibung, Lizenz und VDM-Karte. Python-Werkzeuge unterstützen Auswahl und Vergleich. Optionale ABAP-Berichte werden separat in SE38 angelegt.</w:t>
+        <w:t>Enthalten sind CDS-Quellen, abapGit-Metadaten, Feldzuordnungen, Aktivierungsreihenfolge, Umfangsbeschreibung, Lizenz und VDM-Karte. Python-Werkzeuge unterstützen die Auswahl und Vorbereitung von Quellexporten. Optionale ABAP-Berichte werden getrennt in SE38 angelegt.</w:t>
       </w:r>
     </w:p>
     <w:p>
@@ -801,13 +631,12 @@
       </w:r>
     </w:p>
     <w:p>
-      <w:r>
-        <w:br w:type="page"/>
-      </w:r>
+      <w:r/>
     </w:p>
     <w:p>
       <w:pPr>
         <w:pStyle w:val="Heading1"/>
+        <w:pageBreakBefore/>
       </w:pPr>
       <w:r>
         <w:t>Installation und Nutzung</w:t>
@@ -815,7 +644,7 @@
     </w:p>
     <w:p>
       <w:r>
-        <w:t>1. SOURCE und TARGET entpacken und getrennt in das jeweilige SAP-System importieren. Der äußere Kundenpaket-ZIP ist kein direkter abapGit-Import.</w:t>
+        <w:t>1. Das SOURCE-Archiv entpacken und in das Quellsystem importieren. Der äußere Kundenpaket-ZIP ist kein direkter abapGit-Import.</w:t>
       </w:r>
     </w:p>
     <w:p>
@@ -840,7 +669,7 @@
     </w:p>
     <w:p>
       <w:r>
-        <w:t>6. Identifikatoren und neu erzeugte UUIDs anhand einer separaten Zuordnung abgleichen. Zielpopulation und Quellpopulation gleich abgrenzen.</w:t>
+        <w:t>6. Die ausgewählte Quellpopulation für Stammsätze und Kinddaten konsistent anwenden. Interne Schlüssel, Sprachen, Gültigkeiten und Beziehungen erhalten.</w:t>
       </w:r>
     </w:p>
     <w:p>
@@ -867,13 +696,12 @@
       </w:r>
     </w:p>
     <w:p>
-      <w:r>
-        <w:br w:type="page"/>
-      </w:r>
+      <w:r/>
     </w:p>
     <w:p>
       <w:pPr>
         <w:pStyle w:val="Heading1"/>
+        <w:pageBreakBefore/>
       </w:pPr>
       <w:r>
         <w:t>Umfang und fachliche Regeln</w:t>

</xml_diff>